<commit_message>
update: 女性穿搭指南 Day 7 加入 Mosaics up close closed-toe shoes 要求
</commit_message>
<xml_diff>
--- a/docs/女性穿搭指南.docx
+++ b/docs/女性穿搭指南.docx
@@ -2732,7 +2732,7 @@
         <w:pStyle w:val="Heading2"/>
       </w:pPr>
       <w:r>
-        <w:t>Day 7｜6/20（六）大衛像 + 牛排大餐</w:t>
+        <w:t>Day 7｜6/20（六）大衛像 + Mosaics up close 鷹架 + 牛排大餐</w:t>
       </w:r>
     </w:p>
     <w:p>
@@ -2753,20 +2753,20 @@
         <w:rPr>
           <w:rFonts w:ascii="Microsoft JhengHei" w:hAnsi="Microsoft JhengHei" w:eastAsia="Microsoft JhengHei"/>
         </w:rPr>
-        <w:t>：白天 29-31°C；學院美術館＋聖十字聖殿＋洗禮堂三個場所</w:t>
+        <w:t xml:space="preserve">：白天 29-31°C；學院美術館（博物館，端莊即可）＋ </w:t>
       </w:r>
       <w:r>
         <w:rPr>
           <w:rFonts w:ascii="Microsoft JhengHei" w:hAnsi="Microsoft JhengHei" w:eastAsia="Microsoft JhengHei"/>
           <w:b/>
         </w:rPr>
-        <w:t>全部須遮肩</w:t>
-      </w:r>
-      <w:r>
-        <w:rPr>
-          <w:rFonts w:ascii="Microsoft JhengHei" w:hAnsi="Microsoft JhengHei" w:eastAsia="Microsoft JhengHei"/>
-        </w:rPr>
-        <w:t>；晚上 Trattoria Za Za 牛排大餐建議</w:t>
+        <w:t>Mosaics up close 洗禮堂鷹架（強制 closed-toe shoes）</w:t>
+      </w:r>
+      <w:r>
+        <w:rPr>
+          <w:rFonts w:ascii="Microsoft JhengHei" w:hAnsi="Microsoft JhengHei" w:eastAsia="Microsoft JhengHei"/>
+        </w:rPr>
+        <w:t xml:space="preserve"> ＋聖十字聖殿（遮肩過膝禁夾腳拖）；晚上 Trattoria Za Za 牛排大餐建議</w:t>
       </w:r>
       <w:r>
         <w:rPr>
@@ -2871,20 +2871,46 @@
         <w:rPr>
           <w:rFonts w:ascii="Microsoft JhengHei" w:hAnsi="Microsoft JhengHei" w:eastAsia="Microsoft JhengHei"/>
         </w:rPr>
-        <w:t>：駝色低跟瑪莉珍鞋或軟底芭蕾舞鞋（</w:t>
+        <w:t>：</w:t>
       </w:r>
       <w:r>
         <w:rPr>
           <w:rFonts w:ascii="Microsoft JhengHei" w:hAnsi="Microsoft JhengHei" w:eastAsia="Microsoft JhengHei"/>
           <w:b/>
         </w:rPr>
-        <w:t>晚餐稍微提升正式感</w:t>
-      </w:r>
-      <w:r>
-        <w:rPr>
-          <w:rFonts w:ascii="Microsoft JhengHei" w:hAnsi="Microsoft JhengHei" w:eastAsia="Microsoft JhengHei"/>
-        </w:rPr>
-        <w:t>，但仍能走路）</w:t>
+        <w:t>駝色軟底芭蕾舞鞋</w:t>
+      </w:r>
+      <w:r>
+        <w:rPr>
+          <w:rFonts w:ascii="Microsoft JhengHei" w:hAnsi="Microsoft JhengHei" w:eastAsia="Microsoft JhengHei"/>
+        </w:rPr>
+        <w:t>（首選 — 完全 closed-toe、平底防滑、符合鷹架要求）；或</w:t>
+      </w:r>
+      <w:r>
+        <w:rPr>
+          <w:rFonts w:ascii="Microsoft JhengHei" w:hAnsi="Microsoft JhengHei" w:eastAsia="Microsoft JhengHei"/>
+          <w:b/>
+        </w:rPr>
+        <w:t>包覆式低跟瑪莉珍鞋</w:t>
+      </w:r>
+      <w:r>
+        <w:rPr>
+          <w:rFonts w:ascii="Microsoft JhengHei" w:hAnsi="Microsoft JhengHei" w:eastAsia="Microsoft JhengHei"/>
+        </w:rPr>
+        <w:t xml:space="preserve">（須確認是 </w:t>
+      </w:r>
+      <w:r>
+        <w:rPr>
+          <w:rFonts w:ascii="Microsoft JhengHei" w:hAnsi="Microsoft JhengHei" w:eastAsia="Microsoft JhengHei"/>
+          <w:b/>
+        </w:rPr>
+        <w:t>「rounded closed-toe」</w:t>
+      </w:r>
+      <w:r>
+        <w:rPr>
+          <w:rFonts w:ascii="Microsoft JhengHei" w:hAnsi="Microsoft JhengHei" w:eastAsia="Microsoft JhengHei"/>
+        </w:rPr>
+        <w:t>非露趾款）</w:t>
       </w:r>
     </w:p>
     <w:p>
@@ -2956,20 +2982,20 @@
           <w:rFonts w:ascii="Microsoft JhengHei" w:hAnsi="Microsoft JhengHei" w:eastAsia="Microsoft JhengHei"/>
           <w:b/>
         </w:rPr>
-        <w:t>白天教堂遮肩＋晚上餐廳優雅</w:t>
-      </w:r>
-      <w:r>
-        <w:rPr>
-          <w:rFonts w:ascii="Microsoft JhengHei" w:hAnsi="Microsoft JhengHei" w:eastAsia="Microsoft JhengHei"/>
-        </w:rPr>
-        <w:t>」雙重需求的一天，</w:t>
+        <w:t>白天教堂遮肩＋鷹架閉趾＋晚上餐廳優雅</w:t>
+      </w:r>
+      <w:r>
+        <w:rPr>
+          <w:rFonts w:ascii="Microsoft JhengHei" w:hAnsi="Microsoft JhengHei" w:eastAsia="Microsoft JhengHei"/>
+        </w:rPr>
+        <w:t>」三重需求的一天，</w:t>
       </w:r>
       <w:r>
         <w:rPr>
           <w:rFonts w:ascii="Microsoft JhengHei" w:hAnsi="Microsoft JhengHei" w:eastAsia="Microsoft JhengHei"/>
           <w:b/>
         </w:rPr>
-        <w:t>針織上衣＋百褶裙</w:t>
+        <w:t>針織上衣＋百褶裙＋軟底芭蕾舞鞋</w:t>
       </w:r>
       <w:r>
         <w:rPr>
@@ -3048,7 +3074,7 @@
         <w:rPr>
           <w:rFonts w:ascii="Microsoft JhengHei" w:hAnsi="Microsoft JhengHei" w:eastAsia="Microsoft JhengHei"/>
         </w:rPr>
-        <w:t>進裙頭，搭配窄版皮帶強調腰線；瑪莉珍鞋帶能拉長腳踝視覺。</w:t>
+        <w:t>進裙頭，搭配窄版皮帶強調腰線；芭蕾舞鞋的纖細鞋型不會顯笨重。</w:t>
       </w:r>
     </w:p>
     <w:p>
@@ -3082,20 +3108,20 @@
         <w:rPr>
           <w:rFonts w:ascii="Microsoft JhengHei" w:hAnsi="Microsoft JhengHei" w:eastAsia="Microsoft JhengHei"/>
         </w:rPr>
-        <w:t>）、走廊光影、聖十字聖殿外的廣場、AquaFlor 香氛宮殿的古董櫥窗，</w:t>
+        <w:t>）、Mosaics up close 鷹架上的 13 世紀馬賽克近距離（</w:t>
       </w:r>
       <w:r>
         <w:rPr>
           <w:rFonts w:ascii="Microsoft JhengHei" w:hAnsi="Microsoft JhengHei" w:eastAsia="Microsoft JhengHei"/>
           <w:b/>
         </w:rPr>
-        <w:t>奶茶色系全程在歐式古典背景下完美融入</w:t>
-      </w:r>
-      <w:r>
-        <w:rPr>
-          <w:rFonts w:ascii="Microsoft JhengHei" w:hAnsi="Microsoft JhengHei" w:eastAsia="Microsoft JhengHei"/>
-        </w:rPr>
-        <w:t>；Za Za 牛排館的木質裝潢前氣氛濃郁。</w:t>
+        <w:t>一生一次的鏡頭</w:t>
+      </w:r>
+      <w:r>
+        <w:rPr>
+          <w:rFonts w:ascii="Microsoft JhengHei" w:hAnsi="Microsoft JhengHei" w:eastAsia="Microsoft JhengHei"/>
+        </w:rPr>
+        <w:t>）、聖十字聖殿外的廣場、AquaFlor 香氛宮殿的古董櫥窗。</w:t>
       </w:r>
     </w:p>
     <w:p>
@@ -3129,7 +3155,20 @@
         <w:rPr>
           <w:rFonts w:ascii="Microsoft JhengHei" w:hAnsi="Microsoft JhengHei" w:eastAsia="Microsoft JhengHei"/>
         </w:rPr>
-        <w:t>＋皮帶＋瑪莉珍鞋，更一致的優雅感。</w:t>
+        <w:t>＋皮帶＋</w:t>
+      </w:r>
+      <w:r>
+        <w:rPr>
+          <w:rFonts w:ascii="Microsoft JhengHei" w:hAnsi="Microsoft JhengHei" w:eastAsia="Microsoft JhengHei"/>
+          <w:b/>
+        </w:rPr>
+        <w:t>軟底芭蕾舞鞋</w:t>
+      </w:r>
+      <w:r>
+        <w:rPr>
+          <w:rFonts w:ascii="Microsoft JhengHei" w:hAnsi="Microsoft JhengHei" w:eastAsia="Microsoft JhengHei"/>
+        </w:rPr>
+        <w:t>。</w:t>
       </w:r>
     </w:p>
     <w:p>
@@ -3150,46 +3189,115 @@
         <w:rPr>
           <w:rFonts w:ascii="Microsoft JhengHei" w:hAnsi="Microsoft JhengHei" w:eastAsia="Microsoft JhengHei"/>
         </w:rPr>
-        <w:t xml:space="preserve">：⚠️ </w:t>
+        <w:t>：</w:t>
+      </w:r>
+    </w:p>
+    <w:p>
+      <w:pPr>
+        <w:ind w:left="454" w:hanging="227"/>
+      </w:pPr>
+      <w:r>
+        <w:rPr>
+          <w:rFonts w:ascii="Microsoft JhengHei" w:hAnsi="Microsoft JhengHei" w:eastAsia="Microsoft JhengHei"/>
+          <w:sz w:val="21"/>
+        </w:rPr>
+        <w:t xml:space="preserve">• ⚠️ </w:t>
       </w:r>
       <w:r>
         <w:rPr>
           <w:rFonts w:ascii="Microsoft JhengHei" w:hAnsi="Microsoft JhengHei" w:eastAsia="Microsoft JhengHei"/>
           <w:b/>
-        </w:rPr>
-        <w:t>學院美術館是博物館（非教堂）</w:t>
-      </w:r>
-      <w:r>
-        <w:rPr>
-          <w:rFonts w:ascii="Microsoft JhengHei" w:hAnsi="Microsoft JhengHei" w:eastAsia="Microsoft JhengHei"/>
-        </w:rPr>
-        <w:t xml:space="preserve">，無宗教遮肩規定，但隨身物品超過 </w:t>
+          <w:sz w:val="21"/>
+        </w:rPr>
+        <w:t>Mosaics up close 鷹架強制 closed-toe shoes</w:t>
+      </w:r>
+      <w:r>
+        <w:rPr>
+          <w:rFonts w:ascii="Microsoft JhengHei" w:hAnsi="Microsoft JhengHei" w:eastAsia="Microsoft JhengHei"/>
+          <w:sz w:val="21"/>
+        </w:rPr>
+        <w:t>（不可穿涼鞋、夾腳拖、露趾鞋），10:45 集合時鞋款不符可能被拒進場</w:t>
+      </w:r>
+    </w:p>
+    <w:p>
+      <w:pPr>
+        <w:ind w:left="454" w:hanging="227"/>
+      </w:pPr>
+      <w:r>
+        <w:rPr>
+          <w:rFonts w:ascii="Microsoft JhengHei" w:hAnsi="Microsoft JhengHei" w:eastAsia="Microsoft JhengHei"/>
+          <w:sz w:val="21"/>
+        </w:rPr>
+        <w:t xml:space="preserve">• ⚠️ </w:t>
       </w:r>
       <w:r>
         <w:rPr>
           <w:rFonts w:ascii="Microsoft JhengHei" w:hAnsi="Microsoft JhengHei" w:eastAsia="Microsoft JhengHei"/>
           <w:b/>
+          <w:sz w:val="21"/>
+        </w:rPr>
+        <w:t>學院美術館</w:t>
+      </w:r>
+      <w:r>
+        <w:rPr>
+          <w:rFonts w:ascii="Microsoft JhengHei" w:hAnsi="Microsoft JhengHei" w:eastAsia="Microsoft JhengHei"/>
+          <w:sz w:val="21"/>
+        </w:rPr>
+        <w:t xml:space="preserve">博物館非教堂無遮肩規定，但隨身物品超過 </w:t>
+      </w:r>
+      <w:r>
+        <w:rPr>
+          <w:rFonts w:ascii="Microsoft JhengHei" w:hAnsi="Microsoft JhengHei" w:eastAsia="Microsoft JhengHei"/>
+          <w:b/>
+          <w:sz w:val="21"/>
         </w:rPr>
         <w:t>40×30×18 cm 不能入內、館內也無寄物處</w:t>
       </w:r>
       <w:r>
         <w:rPr>
           <w:rFonts w:ascii="Microsoft JhengHei" w:hAnsi="Microsoft JhengHei" w:eastAsia="Microsoft JhengHei"/>
-        </w:rPr>
-        <w:t>；</w:t>
+          <w:sz w:val="21"/>
+        </w:rPr>
+        <w:t>；大衛像可拍照（禁閃光/自拍棒/腳架）</w:t>
+      </w:r>
+    </w:p>
+    <w:p>
+      <w:pPr>
+        <w:ind w:left="454" w:hanging="227"/>
+      </w:pPr>
+      <w:r>
+        <w:rPr>
+          <w:rFonts w:ascii="Microsoft JhengHei" w:hAnsi="Microsoft JhengHei" w:eastAsia="Microsoft JhengHei"/>
+          <w:sz w:val="21"/>
+        </w:rPr>
+        <w:t xml:space="preserve">• ⚠️ </w:t>
       </w:r>
       <w:r>
         <w:rPr>
           <w:rFonts w:ascii="Microsoft JhengHei" w:hAnsi="Microsoft JhengHei" w:eastAsia="Microsoft JhengHei"/>
           <w:b/>
-        </w:rPr>
-        <w:t>聖十字聖殿與洗禮堂仍須遮肩、過膝、禁夾腳拖</w:t>
-      </w:r>
-      <w:r>
-        <w:rPr>
-          <w:rFonts w:ascii="Microsoft JhengHei" w:hAnsi="Microsoft JhengHei" w:eastAsia="Microsoft JhengHei"/>
-        </w:rPr>
-        <w:t>；Za Za 是 trattoria 屬休閒整潔即可，無正式 dress code。</w:t>
+          <w:sz w:val="21"/>
+        </w:rPr>
+        <w:t>聖十字聖殿</w:t>
+      </w:r>
+      <w:r>
+        <w:rPr>
+          <w:rFonts w:ascii="Microsoft JhengHei" w:hAnsi="Microsoft JhengHei" w:eastAsia="Microsoft JhengHei"/>
+          <w:sz w:val="21"/>
+        </w:rPr>
+        <w:t>遮肩、過膝、禁夾腳拖</w:t>
+      </w:r>
+    </w:p>
+    <w:p>
+      <w:pPr>
+        <w:ind w:left="454" w:hanging="227"/>
+      </w:pPr>
+      <w:r>
+        <w:rPr>
+          <w:rFonts w:ascii="Microsoft JhengHei" w:hAnsi="Microsoft JhengHei" w:eastAsia="Microsoft JhengHei"/>
+          <w:sz w:val="21"/>
+        </w:rPr>
+        <w:t>• ⚠️ Za Za 是 trattoria 屬休閒整潔即可，無正式 dress code</w:t>
       </w:r>
     </w:p>
     <w:p>
@@ -5949,7 +6057,20 @@
                 <w:rFonts w:ascii="Microsoft JhengHei" w:hAnsi="Microsoft JhengHei" w:eastAsia="Microsoft JhengHei"/>
                 <w:sz w:val="19"/>
               </w:rPr>
-              <w:t>聖十字＋洗禮堂</w:t>
+            </w:r>
+            <w:r>
+              <w:rPr>
+                <w:rFonts w:ascii="Microsoft JhengHei" w:hAnsi="Microsoft JhengHei" w:eastAsia="Microsoft JhengHei"/>
+                <w:b/>
+                <w:sz w:val="19"/>
+              </w:rPr>
+              <w:t>Mosaics up close 鷹架</w:t>
+            </w:r>
+            <w:r>
+              <w:rPr>
+                <w:rFonts w:ascii="Microsoft JhengHei" w:hAnsi="Microsoft JhengHei" w:eastAsia="Microsoft JhengHei"/>
+                <w:sz w:val="19"/>
+              </w:rPr>
             </w:r>
           </w:p>
         </w:tc>
@@ -5957,6 +6078,68 @@
           <w:tcPr>
             <w:tcW w:type="dxa" w:w="3024"/>
             <w:shd w:fill="EBF5FB"/>
+          </w:tcPr>
+          <w:p>
+            <w:r/>
+            <w:r>
+              <w:rPr>
+                <w:rFonts w:ascii="Microsoft JhengHei" w:hAnsi="Microsoft JhengHei" w:eastAsia="Microsoft JhengHei"/>
+                <w:sz w:val="19"/>
+              </w:rPr>
+              <w:t xml:space="preserve">⚠️ </w:t>
+            </w:r>
+            <w:r>
+              <w:rPr>
+                <w:rFonts w:ascii="Microsoft JhengHei" w:hAnsi="Microsoft JhengHei" w:eastAsia="Microsoft JhengHei"/>
+                <w:b/>
+                <w:sz w:val="19"/>
+              </w:rPr>
+              <w:t>強制 closed-toe shoes</w:t>
+            </w:r>
+            <w:r>
+              <w:rPr>
+                <w:rFonts w:ascii="Microsoft JhengHei" w:hAnsi="Microsoft JhengHei" w:eastAsia="Microsoft JhengHei"/>
+                <w:sz w:val="19"/>
+              </w:rPr>
+              <w:t>（不可穿涼鞋/夾腳拖/露趾鞋）</w:t>
+            </w:r>
+          </w:p>
+        </w:tc>
+      </w:tr>
+      <w:tr>
+        <w:tc>
+          <w:tcPr>
+            <w:tcW w:type="dxa" w:w="3024"/>
+          </w:tcPr>
+          <w:p>
+            <w:r/>
+            <w:r>
+              <w:rPr>
+                <w:rFonts w:ascii="Microsoft JhengHei" w:hAnsi="Microsoft JhengHei" w:eastAsia="Microsoft JhengHei"/>
+                <w:sz w:val="19"/>
+              </w:rPr>
+              <w:t>Day 7</w:t>
+            </w:r>
+          </w:p>
+        </w:tc>
+        <w:tc>
+          <w:tcPr>
+            <w:tcW w:type="dxa" w:w="3024"/>
+          </w:tcPr>
+          <w:p>
+            <w:r/>
+            <w:r>
+              <w:rPr>
+                <w:rFonts w:ascii="Microsoft JhengHei" w:hAnsi="Microsoft JhengHei" w:eastAsia="Microsoft JhengHei"/>
+                <w:sz w:val="19"/>
+              </w:rPr>
+              <w:t>聖十字聖殿</w:t>
+            </w:r>
+          </w:p>
+        </w:tc>
+        <w:tc>
+          <w:tcPr>
+            <w:tcW w:type="dxa" w:w="3024"/>
           </w:tcPr>
           <w:p>
             <w:r/>
@@ -5974,6 +6157,7 @@
         <w:tc>
           <w:tcPr>
             <w:tcW w:type="dxa" w:w="3024"/>
+            <w:shd w:fill="EBF5FB"/>
           </w:tcPr>
           <w:p>
             <w:r/>
@@ -5989,6 +6173,7 @@
         <w:tc>
           <w:tcPr>
             <w:tcW w:type="dxa" w:w="3024"/>
+            <w:shd w:fill="EBF5FB"/>
           </w:tcPr>
           <w:p>
             <w:r/>
@@ -6004,6 +6189,7 @@
         <w:tc>
           <w:tcPr>
             <w:tcW w:type="dxa" w:w="3024"/>
+            <w:shd w:fill="EBF5FB"/>
           </w:tcPr>
           <w:p>
             <w:r/>
@@ -6036,7 +6222,6 @@
         <w:tc>
           <w:tcPr>
             <w:tcW w:type="dxa" w:w="3024"/>
-            <w:shd w:fill="EBF5FB"/>
           </w:tcPr>
           <w:p>
             <w:r/>
@@ -6052,7 +6237,6 @@
         <w:tc>
           <w:tcPr>
             <w:tcW w:type="dxa" w:w="3024"/>
-            <w:shd w:fill="EBF5FB"/>
           </w:tcPr>
           <w:p>
             <w:r/>
@@ -6068,7 +6252,6 @@
         <w:tc>
           <w:tcPr>
             <w:tcW w:type="dxa" w:w="3024"/>
-            <w:shd w:fill="EBF5FB"/>
           </w:tcPr>
           <w:p>
             <w:r/>

</xml_diff>